<commit_message>
Changed README.md/ Added functionality to allow for user to enter filepath of .scsbv <-- ignore that. .csv
</commit_message>
<xml_diff>
--- a/20260427_UGMFGT_15_1_JWESTING_P_Factor_Analyser_Logbook.docx
+++ b/20260427_UGMFGT_15_1_JWESTING_P_Factor_Analyser_Logbook.docx
@@ -5,19 +5,770 @@
     <w:p>
       <w:pPr>
         <w:pStyle w:val="Title"/>
-        <w:rPr>
-          <w:rFonts w:ascii="Arial" w:hAnsi="Arial" w:cs="Arial"/>
+      </w:pPr>
+      <w:r>
+        <w:t xml:space="preserve">Power Factor </w:t>
+      </w:r>
+      <w:proofErr w:type="spellStart"/>
+      <w:r>
+        <w:t>Analyser</w:t>
+      </w:r>
+      <w:proofErr w:type="spellEnd"/>
+      <w:r>
+        <w:t xml:space="preserve"> – Project Logbook</w:t>
+      </w:r>
+    </w:p>
+    <w:tbl>
+      <w:tblPr>
+        <w:tblStyle w:val="TableGrid"/>
+        <w:tblW w:w="0" w:type="auto"/>
+        <w:jc w:val="center"/>
+        <w:tblBorders>
+          <w:top w:val="none" w:sz="0" w:space="0" w:color="auto"/>
+          <w:left w:val="none" w:sz="0" w:space="0" w:color="auto"/>
+          <w:bottom w:val="none" w:sz="0" w:space="0" w:color="auto"/>
+          <w:right w:val="none" w:sz="0" w:space="0" w:color="auto"/>
+          <w:insideH w:val="none" w:sz="0" w:space="0" w:color="auto"/>
+          <w:insideV w:val="none" w:sz="0" w:space="0" w:color="auto"/>
+        </w:tblBorders>
+        <w:tblLook w:val="04A0" w:firstRow="1" w:lastRow="0" w:firstColumn="1" w:lastColumn="0" w:noHBand="0" w:noVBand="1"/>
+      </w:tblPr>
+      <w:tblGrid>
+        <w:gridCol w:w="1843"/>
+        <w:gridCol w:w="4386"/>
+      </w:tblGrid>
+      <w:tr>
+        <w:trPr>
+          <w:jc w:val="center"/>
+        </w:trPr>
+        <w:tc>
+          <w:tcPr>
+            <w:tcW w:w="0" w:type="auto"/>
+          </w:tcPr>
+          <w:p>
+            <w:pPr>
+              <w:jc w:val="right"/>
+              <w:rPr>
+                <w:rFonts w:ascii="Arial" w:hAnsi="Arial" w:cs="Arial"/>
+              </w:rPr>
+            </w:pPr>
+            <w:r>
+              <w:rPr>
+                <w:rFonts w:ascii="Arial" w:hAnsi="Arial" w:cs="Arial"/>
+              </w:rPr>
+              <w:t xml:space="preserve">Student </w:t>
+            </w:r>
+            <w:r>
+              <w:rPr>
+                <w:rFonts w:ascii="Arial" w:hAnsi="Arial" w:cs="Arial"/>
+              </w:rPr>
+              <w:t>Name:</w:t>
+            </w:r>
+          </w:p>
+        </w:tc>
+        <w:tc>
+          <w:tcPr>
+            <w:tcW w:w="0" w:type="auto"/>
+          </w:tcPr>
+          <w:p>
+            <w:pPr>
+              <w:rPr>
+                <w:rFonts w:ascii="Arial" w:hAnsi="Arial" w:cs="Arial"/>
+              </w:rPr>
+            </w:pPr>
+            <w:r>
+              <w:rPr>
+                <w:rFonts w:ascii="Arial" w:hAnsi="Arial" w:cs="Arial"/>
+              </w:rPr>
+              <w:t>Joseph Westing</w:t>
+            </w:r>
+          </w:p>
+        </w:tc>
+      </w:tr>
+      <w:tr>
+        <w:trPr>
+          <w:jc w:val="center"/>
+        </w:trPr>
+        <w:tc>
+          <w:tcPr>
+            <w:tcW w:w="0" w:type="auto"/>
+          </w:tcPr>
+          <w:p>
+            <w:pPr>
+              <w:jc w:val="right"/>
+              <w:rPr>
+                <w:rFonts w:ascii="Arial" w:hAnsi="Arial" w:cs="Arial"/>
+              </w:rPr>
+            </w:pPr>
+            <w:r>
+              <w:rPr>
+                <w:rFonts w:ascii="Arial" w:hAnsi="Arial" w:cs="Arial"/>
+              </w:rPr>
+              <w:t>Student number:</w:t>
+            </w:r>
+          </w:p>
+        </w:tc>
+        <w:tc>
+          <w:tcPr>
+            <w:tcW w:w="0" w:type="auto"/>
+          </w:tcPr>
+          <w:p>
+            <w:pPr>
+              <w:rPr>
+                <w:rFonts w:ascii="Arial" w:hAnsi="Arial" w:cs="Arial"/>
+              </w:rPr>
+            </w:pPr>
+            <w:r>
+              <w:rPr>
+                <w:rFonts w:ascii="Arial" w:hAnsi="Arial" w:cs="Arial"/>
+              </w:rPr>
+              <w:t>24026929</w:t>
+            </w:r>
+          </w:p>
+        </w:tc>
+      </w:tr>
+      <w:tr>
+        <w:trPr>
+          <w:jc w:val="center"/>
+        </w:trPr>
+        <w:tc>
+          <w:tcPr>
+            <w:tcW w:w="0" w:type="auto"/>
+          </w:tcPr>
+          <w:p>
+            <w:pPr>
+              <w:jc w:val="right"/>
+              <w:rPr>
+                <w:rFonts w:ascii="Arial" w:hAnsi="Arial" w:cs="Arial"/>
+              </w:rPr>
+            </w:pPr>
+            <w:r>
+              <w:rPr>
+                <w:rFonts w:ascii="Arial" w:hAnsi="Arial" w:cs="Arial"/>
+              </w:rPr>
+              <w:t>Module:</w:t>
+            </w:r>
+          </w:p>
+        </w:tc>
+        <w:tc>
+          <w:tcPr>
+            <w:tcW w:w="0" w:type="auto"/>
+          </w:tcPr>
+          <w:p>
+            <w:pPr>
+              <w:rPr>
+                <w:rFonts w:ascii="Arial" w:hAnsi="Arial" w:cs="Arial"/>
+              </w:rPr>
+            </w:pPr>
+            <w:r>
+              <w:rPr>
+                <w:rFonts w:ascii="Arial" w:hAnsi="Arial" w:cs="Arial"/>
+              </w:rPr>
+              <w:t>UGMFGT_15_1</w:t>
+            </w:r>
+          </w:p>
+        </w:tc>
+      </w:tr>
+      <w:tr>
+        <w:trPr>
+          <w:jc w:val="center"/>
+        </w:trPr>
+        <w:tc>
+          <w:tcPr>
+            <w:tcW w:w="0" w:type="auto"/>
+          </w:tcPr>
+          <w:p>
+            <w:pPr>
+              <w:jc w:val="right"/>
+              <w:rPr>
+                <w:rFonts w:ascii="Arial" w:hAnsi="Arial" w:cs="Arial"/>
+              </w:rPr>
+            </w:pPr>
+            <w:r>
+              <w:rPr>
+                <w:rFonts w:ascii="Arial" w:hAnsi="Arial" w:cs="Arial"/>
+              </w:rPr>
+              <w:t>Subject:</w:t>
+            </w:r>
+          </w:p>
+        </w:tc>
+        <w:tc>
+          <w:tcPr>
+            <w:tcW w:w="0" w:type="auto"/>
+          </w:tcPr>
+          <w:p>
+            <w:pPr>
+              <w:rPr>
+                <w:rFonts w:ascii="Arial" w:hAnsi="Arial" w:cs="Arial"/>
+              </w:rPr>
+            </w:pPr>
+            <w:r>
+              <w:rPr>
+                <w:rFonts w:ascii="Arial" w:hAnsi="Arial" w:cs="Arial"/>
+              </w:rPr>
+              <w:t>Programming for Engineers</w:t>
+            </w:r>
+          </w:p>
+        </w:tc>
+      </w:tr>
+      <w:tr>
+        <w:trPr>
+          <w:jc w:val="center"/>
+        </w:trPr>
+        <w:tc>
+          <w:tcPr>
+            <w:tcW w:w="0" w:type="auto"/>
+          </w:tcPr>
+          <w:p>
+            <w:pPr>
+              <w:jc w:val="right"/>
+              <w:rPr>
+                <w:rFonts w:ascii="Arial" w:hAnsi="Arial" w:cs="Arial"/>
+              </w:rPr>
+            </w:pPr>
+            <w:r>
+              <w:rPr>
+                <w:rFonts w:ascii="Arial" w:hAnsi="Arial" w:cs="Arial"/>
+              </w:rPr>
+              <w:t>Project:</w:t>
+            </w:r>
+          </w:p>
+        </w:tc>
+        <w:tc>
+          <w:tcPr>
+            <w:tcW w:w="0" w:type="auto"/>
+          </w:tcPr>
+          <w:p>
+            <w:pPr>
+              <w:rPr>
+                <w:rFonts w:ascii="Arial" w:hAnsi="Arial" w:cs="Arial"/>
+              </w:rPr>
+            </w:pPr>
+            <w:r>
+              <w:rPr>
+                <w:rFonts w:ascii="Arial" w:hAnsi="Arial" w:cs="Arial"/>
+              </w:rPr>
+              <w:t xml:space="preserve">Power Factor </w:t>
+            </w:r>
+            <w:proofErr w:type="spellStart"/>
+            <w:r>
+              <w:rPr>
+                <w:rFonts w:ascii="Arial" w:hAnsi="Arial" w:cs="Arial"/>
+              </w:rPr>
+              <w:t>Analyser</w:t>
+            </w:r>
+            <w:proofErr w:type="spellEnd"/>
+          </w:p>
+        </w:tc>
+      </w:tr>
+      <w:tr>
+        <w:trPr>
+          <w:jc w:val="center"/>
+        </w:trPr>
+        <w:tc>
+          <w:tcPr>
+            <w:tcW w:w="0" w:type="auto"/>
+          </w:tcPr>
+          <w:p>
+            <w:pPr>
+              <w:jc w:val="right"/>
+              <w:rPr>
+                <w:rFonts w:ascii="Arial" w:hAnsi="Arial" w:cs="Arial"/>
+              </w:rPr>
+            </w:pPr>
+            <w:r>
+              <w:rPr>
+                <w:rFonts w:ascii="Arial" w:hAnsi="Arial" w:cs="Arial"/>
+              </w:rPr>
+              <w:t>Tutors:</w:t>
+            </w:r>
+          </w:p>
+        </w:tc>
+        <w:tc>
+          <w:tcPr>
+            <w:tcW w:w="0" w:type="auto"/>
+          </w:tcPr>
+          <w:p>
+            <w:pPr>
+              <w:rPr>
+                <w:rFonts w:ascii="Arial" w:hAnsi="Arial" w:cs="Arial"/>
+              </w:rPr>
+            </w:pPr>
+            <w:r>
+              <w:rPr>
+                <w:rFonts w:ascii="Arial" w:hAnsi="Arial" w:cs="Arial"/>
+              </w:rPr>
+              <w:t>Ghaly Mikhail</w:t>
+            </w:r>
+            <w:r>
+              <w:rPr>
+                <w:rFonts w:ascii="Arial" w:hAnsi="Arial" w:cs="Arial"/>
+              </w:rPr>
+              <w:t xml:space="preserve">, </w:t>
+            </w:r>
+            <w:r>
+              <w:rPr>
+                <w:rFonts w:ascii="Arial" w:hAnsi="Arial" w:cs="Arial"/>
+              </w:rPr>
+              <w:t>Tom Knowles</w:t>
+            </w:r>
+            <w:r>
+              <w:rPr>
+                <w:rFonts w:ascii="Arial" w:hAnsi="Arial" w:cs="Arial"/>
+              </w:rPr>
+              <w:t xml:space="preserve">, </w:t>
+            </w:r>
+            <w:r>
+              <w:rPr>
+                <w:rFonts w:ascii="Arial" w:hAnsi="Arial" w:cs="Arial"/>
+              </w:rPr>
+              <w:t>Paul Worgan</w:t>
+            </w:r>
+          </w:p>
+        </w:tc>
+      </w:tr>
+    </w:tbl>
+    <w:p/>
+    <w:sdt>
+      <w:sdtPr>
+        <w:rPr>
+          <w:lang w:val="en-GB"/>
+        </w:rPr>
+        <w:id w:val="-1379847516"/>
+        <w:docPartObj>
+          <w:docPartGallery w:val="Table of Contents"/>
+          <w:docPartUnique/>
+        </w:docPartObj>
+      </w:sdtPr>
+      <w:sdtEndPr>
+        <w:rPr>
+          <w:rFonts w:asciiTheme="minorHAnsi" w:eastAsiaTheme="minorEastAsia" w:hAnsiTheme="minorHAnsi" w:cstheme="minorBidi"/>
           <w:sz w:val="22"/>
           <w:szCs w:val="22"/>
-        </w:rPr>
-      </w:pPr>
-      <w:r>
-        <w:rPr>
-          <w:rFonts w:ascii="Arial" w:hAnsi="Arial" w:cs="Arial"/>
-          <w:sz w:val="22"/>
-          <w:szCs w:val="22"/>
-        </w:rPr>
-        <w:t>Power Factor Analyser – Project Logbook</w:t>
+          <w:lang w:val="en-US"/>
+        </w:rPr>
+      </w:sdtEndPr>
+      <w:sdtContent>
+        <w:p>
+          <w:pPr>
+            <w:pStyle w:val="TOCHeading"/>
+          </w:pPr>
+          <w:r>
+            <w:rPr>
+              <w:lang w:val="en-GB"/>
+            </w:rPr>
+            <w:t>Contents</w:t>
+          </w:r>
+        </w:p>
+        <w:p>
+          <w:pPr>
+            <w:pStyle w:val="TOC1"/>
+            <w:tabs>
+              <w:tab w:val="left" w:pos="480"/>
+              <w:tab w:val="right" w:leader="dot" w:pos="9962"/>
+            </w:tabs>
+            <w:rPr>
+              <w:noProof/>
+              <w:kern w:val="2"/>
+              <w:sz w:val="24"/>
+              <w:szCs w:val="24"/>
+              <w:lang w:val="en-GB" w:eastAsia="en-GB"/>
+              <w14:ligatures w14:val="standardContextual"/>
+            </w:rPr>
+          </w:pPr>
+          <w:r>
+            <w:fldChar w:fldCharType="begin"/>
+          </w:r>
+          <w:r>
+            <w:instrText xml:space="preserve"> TOC \o "1-3" \h \z \u </w:instrText>
+          </w:r>
+          <w:r>
+            <w:fldChar w:fldCharType="separate"/>
+          </w:r>
+          <w:hyperlink w:anchor="_Toc228450357" w:history="1">
+            <w:r>
+              <w:rPr>
+                <w:rStyle w:val="Hyperlink"/>
+                <w:rFonts w:cs="Arial"/>
+                <w:noProof/>
+              </w:rPr>
+              <w:t>1.</w:t>
+            </w:r>
+            <w:r>
+              <w:rPr>
+                <w:noProof/>
+                <w:kern w:val="2"/>
+                <w:sz w:val="24"/>
+                <w:szCs w:val="24"/>
+                <w:lang w:val="en-GB" w:eastAsia="en-GB"/>
+                <w14:ligatures w14:val="standardContextual"/>
+              </w:rPr>
+              <w:tab/>
+            </w:r>
+            <w:r>
+              <w:rPr>
+                <w:rStyle w:val="Hyperlink"/>
+                <w:rFonts w:cs="Arial"/>
+                <w:noProof/>
+              </w:rPr>
+              <w:t>Design</w:t>
+            </w:r>
+            <w:r>
+              <w:rPr>
+                <w:noProof/>
+                <w:webHidden/>
+              </w:rPr>
+              <w:tab/>
+            </w:r>
+            <w:r>
+              <w:rPr>
+                <w:noProof/>
+                <w:webHidden/>
+              </w:rPr>
+              <w:fldChar w:fldCharType="begin"/>
+            </w:r>
+            <w:r>
+              <w:rPr>
+                <w:noProof/>
+                <w:webHidden/>
+              </w:rPr>
+              <w:instrText xml:space="preserve"> PAGEREF _Toc228450357 \h </w:instrText>
+            </w:r>
+            <w:r>
+              <w:rPr>
+                <w:noProof/>
+                <w:webHidden/>
+              </w:rPr>
+            </w:r>
+            <w:r>
+              <w:rPr>
+                <w:noProof/>
+                <w:webHidden/>
+              </w:rPr>
+              <w:fldChar w:fldCharType="separate"/>
+            </w:r>
+            <w:r>
+              <w:rPr>
+                <w:noProof/>
+                <w:webHidden/>
+              </w:rPr>
+              <w:t>2</w:t>
+            </w:r>
+            <w:r>
+              <w:rPr>
+                <w:noProof/>
+                <w:webHidden/>
+              </w:rPr>
+              <w:fldChar w:fldCharType="end"/>
+            </w:r>
+          </w:hyperlink>
+        </w:p>
+        <w:p>
+          <w:pPr>
+            <w:pStyle w:val="TOC1"/>
+            <w:tabs>
+              <w:tab w:val="left" w:pos="480"/>
+              <w:tab w:val="right" w:leader="dot" w:pos="9962"/>
+            </w:tabs>
+            <w:rPr>
+              <w:noProof/>
+              <w:kern w:val="2"/>
+              <w:sz w:val="24"/>
+              <w:szCs w:val="24"/>
+              <w:lang w:val="en-GB" w:eastAsia="en-GB"/>
+              <w14:ligatures w14:val="standardContextual"/>
+            </w:rPr>
+          </w:pPr>
+          <w:hyperlink w:anchor="_Toc228450358" w:history="1">
+            <w:r>
+              <w:rPr>
+                <w:rStyle w:val="Hyperlink"/>
+                <w:rFonts w:cs="Arial"/>
+                <w:noProof/>
+              </w:rPr>
+              <w:t>2.</w:t>
+            </w:r>
+            <w:r>
+              <w:rPr>
+                <w:noProof/>
+                <w:kern w:val="2"/>
+                <w:sz w:val="24"/>
+                <w:szCs w:val="24"/>
+                <w:lang w:val="en-GB" w:eastAsia="en-GB"/>
+                <w14:ligatures w14:val="standardContextual"/>
+              </w:rPr>
+              <w:tab/>
+            </w:r>
+            <w:r>
+              <w:rPr>
+                <w:rStyle w:val="Hyperlink"/>
+                <w:rFonts w:cs="Arial"/>
+                <w:noProof/>
+              </w:rPr>
+              <w:t>Development</w:t>
+            </w:r>
+            <w:r>
+              <w:rPr>
+                <w:noProof/>
+                <w:webHidden/>
+              </w:rPr>
+              <w:tab/>
+            </w:r>
+            <w:r>
+              <w:rPr>
+                <w:noProof/>
+                <w:webHidden/>
+              </w:rPr>
+              <w:fldChar w:fldCharType="begin"/>
+            </w:r>
+            <w:r>
+              <w:rPr>
+                <w:noProof/>
+                <w:webHidden/>
+              </w:rPr>
+              <w:instrText xml:space="preserve"> PAGEREF _Toc228450358 \h </w:instrText>
+            </w:r>
+            <w:r>
+              <w:rPr>
+                <w:noProof/>
+                <w:webHidden/>
+              </w:rPr>
+            </w:r>
+            <w:r>
+              <w:rPr>
+                <w:noProof/>
+                <w:webHidden/>
+              </w:rPr>
+              <w:fldChar w:fldCharType="separate"/>
+            </w:r>
+            <w:r>
+              <w:rPr>
+                <w:noProof/>
+                <w:webHidden/>
+              </w:rPr>
+              <w:t>2</w:t>
+            </w:r>
+            <w:r>
+              <w:rPr>
+                <w:noProof/>
+                <w:webHidden/>
+              </w:rPr>
+              <w:fldChar w:fldCharType="end"/>
+            </w:r>
+          </w:hyperlink>
+        </w:p>
+        <w:p>
+          <w:pPr>
+            <w:pStyle w:val="TOC1"/>
+            <w:tabs>
+              <w:tab w:val="left" w:pos="480"/>
+              <w:tab w:val="right" w:leader="dot" w:pos="9962"/>
+            </w:tabs>
+            <w:rPr>
+              <w:noProof/>
+              <w:kern w:val="2"/>
+              <w:sz w:val="24"/>
+              <w:szCs w:val="24"/>
+              <w:lang w:val="en-GB" w:eastAsia="en-GB"/>
+              <w14:ligatures w14:val="standardContextual"/>
+            </w:rPr>
+          </w:pPr>
+          <w:hyperlink w:anchor="_Toc228450359" w:history="1">
+            <w:r>
+              <w:rPr>
+                <w:rStyle w:val="Hyperlink"/>
+                <w:rFonts w:cs="Arial"/>
+                <w:noProof/>
+              </w:rPr>
+              <w:t>3.</w:t>
+            </w:r>
+            <w:r>
+              <w:rPr>
+                <w:noProof/>
+                <w:kern w:val="2"/>
+                <w:sz w:val="24"/>
+                <w:szCs w:val="24"/>
+                <w:lang w:val="en-GB" w:eastAsia="en-GB"/>
+                <w14:ligatures w14:val="standardContextual"/>
+              </w:rPr>
+              <w:tab/>
+            </w:r>
+            <w:r>
+              <w:rPr>
+                <w:rStyle w:val="Hyperlink"/>
+                <w:rFonts w:cs="Arial"/>
+                <w:noProof/>
+              </w:rPr>
+              <w:t>Testing</w:t>
+            </w:r>
+            <w:r>
+              <w:rPr>
+                <w:noProof/>
+                <w:webHidden/>
+              </w:rPr>
+              <w:tab/>
+            </w:r>
+            <w:r>
+              <w:rPr>
+                <w:noProof/>
+                <w:webHidden/>
+              </w:rPr>
+              <w:fldChar w:fldCharType="begin"/>
+            </w:r>
+            <w:r>
+              <w:rPr>
+                <w:noProof/>
+                <w:webHidden/>
+              </w:rPr>
+              <w:instrText xml:space="preserve"> PAGEREF _Toc228450359 \h </w:instrText>
+            </w:r>
+            <w:r>
+              <w:rPr>
+                <w:noProof/>
+                <w:webHidden/>
+              </w:rPr>
+            </w:r>
+            <w:r>
+              <w:rPr>
+                <w:noProof/>
+                <w:webHidden/>
+              </w:rPr>
+              <w:fldChar w:fldCharType="separate"/>
+            </w:r>
+            <w:r>
+              <w:rPr>
+                <w:noProof/>
+                <w:webHidden/>
+              </w:rPr>
+              <w:t>7</w:t>
+            </w:r>
+            <w:r>
+              <w:rPr>
+                <w:noProof/>
+                <w:webHidden/>
+              </w:rPr>
+              <w:fldChar w:fldCharType="end"/>
+            </w:r>
+          </w:hyperlink>
+        </w:p>
+        <w:p>
+          <w:pPr>
+            <w:pStyle w:val="TOC1"/>
+            <w:tabs>
+              <w:tab w:val="left" w:pos="480"/>
+              <w:tab w:val="right" w:leader="dot" w:pos="9962"/>
+            </w:tabs>
+            <w:rPr>
+              <w:noProof/>
+              <w:kern w:val="2"/>
+              <w:sz w:val="24"/>
+              <w:szCs w:val="24"/>
+              <w:lang w:val="en-GB" w:eastAsia="en-GB"/>
+              <w14:ligatures w14:val="standardContextual"/>
+            </w:rPr>
+          </w:pPr>
+          <w:hyperlink w:anchor="_Toc228450360" w:history="1">
+            <w:r>
+              <w:rPr>
+                <w:rStyle w:val="Hyperlink"/>
+                <w:rFonts w:cs="Arial"/>
+                <w:noProof/>
+              </w:rPr>
+              <w:t>4.</w:t>
+            </w:r>
+            <w:r>
+              <w:rPr>
+                <w:noProof/>
+                <w:kern w:val="2"/>
+                <w:sz w:val="24"/>
+                <w:szCs w:val="24"/>
+                <w:lang w:val="en-GB" w:eastAsia="en-GB"/>
+                <w14:ligatures w14:val="standardContextual"/>
+              </w:rPr>
+              <w:tab/>
+            </w:r>
+            <w:r>
+              <w:rPr>
+                <w:rStyle w:val="Hyperlink"/>
+                <w:rFonts w:cs="Arial"/>
+                <w:noProof/>
+              </w:rPr>
+              <w:t>Reflection</w:t>
+            </w:r>
+            <w:r>
+              <w:rPr>
+                <w:noProof/>
+                <w:webHidden/>
+              </w:rPr>
+              <w:tab/>
+            </w:r>
+            <w:r>
+              <w:rPr>
+                <w:noProof/>
+                <w:webHidden/>
+              </w:rPr>
+              <w:fldChar w:fldCharType="begin"/>
+            </w:r>
+            <w:r>
+              <w:rPr>
+                <w:noProof/>
+                <w:webHidden/>
+              </w:rPr>
+              <w:instrText xml:space="preserve"> PAGEREF _Toc228450360 \h </w:instrText>
+            </w:r>
+            <w:r>
+              <w:rPr>
+                <w:noProof/>
+                <w:webHidden/>
+              </w:rPr>
+            </w:r>
+            <w:r>
+              <w:rPr>
+                <w:noProof/>
+                <w:webHidden/>
+              </w:rPr>
+              <w:fldChar w:fldCharType="separate"/>
+            </w:r>
+            <w:r>
+              <w:rPr>
+                <w:noProof/>
+                <w:webHidden/>
+              </w:rPr>
+              <w:t>8</w:t>
+            </w:r>
+            <w:r>
+              <w:rPr>
+                <w:noProof/>
+                <w:webHidden/>
+              </w:rPr>
+              <w:fldChar w:fldCharType="end"/>
+            </w:r>
+          </w:hyperlink>
+        </w:p>
+        <w:p>
+          <w:r>
+            <w:rPr>
+              <w:b/>
+              <w:bCs/>
+            </w:rPr>
+            <w:fldChar w:fldCharType="end"/>
+          </w:r>
+        </w:p>
+      </w:sdtContent>
+    </w:sdt>
+    <w:p>
+      <w:pPr>
+        <w:rPr>
+          <w:rFonts w:ascii="Arial" w:eastAsiaTheme="majorEastAsia" w:hAnsi="Arial" w:cs="Arial"/>
+          <w:b/>
+          <w:bCs/>
+        </w:rPr>
+      </w:pPr>
+      <w:r>
+        <w:rPr>
+          <w:rFonts w:cs="Arial"/>
+        </w:rPr>
+        <w:br w:type="page"/>
       </w:r>
     </w:p>
     <w:p>
@@ -33,14 +784,17 @@
           <w:szCs w:val="22"/>
         </w:rPr>
       </w:pPr>
+      <w:bookmarkStart w:id="0" w:name="_Toc228450357"/>
       <w:r>
         <w:rPr>
           <w:rFonts w:cs="Arial"/>
           <w:sz w:val="22"/>
           <w:szCs w:val="22"/>
         </w:rPr>
+        <w:lastRenderedPageBreak/>
         <w:t>Design</w:t>
       </w:r>
+      <w:bookmarkEnd w:id="0"/>
     </w:p>
     <w:p>
       <w:pPr>
@@ -426,6 +1180,22 @@
     </w:p>
     <w:p>
       <w:pPr>
+        <w:rPr>
+          <w:rFonts w:ascii="Arial" w:eastAsiaTheme="majorEastAsia" w:hAnsi="Arial" w:cs="Arial"/>
+          <w:b/>
+          <w:bCs/>
+        </w:rPr>
+      </w:pPr>
+      <w:bookmarkStart w:id="1" w:name="_Toc228450358"/>
+      <w:r>
+        <w:rPr>
+          <w:rFonts w:cs="Arial"/>
+        </w:rPr>
+        <w:br w:type="page"/>
+      </w:r>
+    </w:p>
+    <w:p>
+      <w:pPr>
         <w:pStyle w:val="Heading1"/>
         <w:numPr>
           <w:ilvl w:val="0"/>
@@ -446,6 +1216,7 @@
         <w:lastRenderedPageBreak/>
         <w:t>Development</w:t>
       </w:r>
+      <w:bookmarkEnd w:id="1"/>
     </w:p>
     <w:p>
       <w:pPr>
@@ -729,6 +1500,7 @@
                           <w:p>
                             <w:pPr>
                               <w:rPr>
+                                <w:rFonts w:ascii="Courier New" w:hAnsi="Courier New" w:cs="Courier New"/>
                                 <w:i/>
                                 <w:iCs/>
                                 <w:lang w:val="en-GB"/>
@@ -736,6 +1508,7 @@
                             </w:pPr>
                             <w:r>
                               <w:rPr>
+                                <w:rFonts w:ascii="Courier New" w:hAnsi="Courier New" w:cs="Courier New"/>
                                 <w:i/>
                                 <w:iCs/>
                                 <w:lang w:val="en-GB"/>
@@ -744,6 +1517,7 @@
                             </w:r>
                             <w:r>
                               <w:rPr>
+                                <w:rFonts w:ascii="Courier New" w:hAnsi="Courier New" w:cs="Courier New"/>
                                 <w:i/>
                                 <w:iCs/>
                                 <w:lang w:val="en-GB"/>
@@ -753,6 +1527,7 @@
                             </w:r>
                             <w:r>
                               <w:rPr>
+                                <w:rFonts w:ascii="Courier New" w:hAnsi="Courier New" w:cs="Courier New"/>
                                 <w:i/>
                                 <w:iCs/>
                                 <w:lang w:val="en-GB"/>
@@ -763,6 +1538,7 @@
                             <w:proofErr w:type="spellStart"/>
                             <w:r>
                               <w:rPr>
+                                <w:rFonts w:ascii="Courier New" w:hAnsi="Courier New" w:cs="Courier New"/>
                                 <w:i/>
                                 <w:iCs/>
                                 <w:lang w:val="en-GB"/>
@@ -772,6 +1548,7 @@
                             <w:proofErr w:type="spellEnd"/>
                             <w:r>
                               <w:rPr>
+                                <w:rFonts w:ascii="Courier New" w:hAnsi="Courier New" w:cs="Courier New"/>
                                 <w:i/>
                                 <w:iCs/>
                                 <w:lang w:val="en-GB"/>
@@ -780,6 +1557,7 @@
                             </w:r>
                             <w:r>
                               <w:rPr>
+                                <w:rFonts w:ascii="Courier New" w:hAnsi="Courier New" w:cs="Courier New"/>
                                 <w:i/>
                                 <w:iCs/>
                                 <w:lang w:val="en-GB"/>
@@ -790,6 +1568,7 @@
                             <w:proofErr w:type="spellStart"/>
                             <w:r>
                               <w:rPr>
+                                <w:rFonts w:ascii="Courier New" w:hAnsi="Courier New" w:cs="Courier New"/>
                                 <w:i/>
                                 <w:iCs/>
                                 <w:lang w:val="en-GB"/>
@@ -799,6 +1578,7 @@
                             <w:proofErr w:type="spellEnd"/>
                             <w:r>
                               <w:rPr>
+                                <w:rFonts w:ascii="Courier New" w:hAnsi="Courier New" w:cs="Courier New"/>
                                 <w:i/>
                                 <w:iCs/>
                                 <w:lang w:val="en-GB"/>
@@ -807,6 +1587,7 @@
                             </w:r>
                             <w:r>
                               <w:rPr>
+                                <w:rFonts w:ascii="Courier New" w:hAnsi="Courier New" w:cs="Courier New"/>
                                 <w:i/>
                                 <w:iCs/>
                                 <w:lang w:val="en-GB"/>
@@ -817,6 +1598,7 @@
                             <w:proofErr w:type="spellStart"/>
                             <w:r>
                               <w:rPr>
+                                <w:rFonts w:ascii="Courier New" w:hAnsi="Courier New" w:cs="Courier New"/>
                                 <w:i/>
                                 <w:iCs/>
                                 <w:lang w:val="en-GB"/>
@@ -826,6 +1608,7 @@
                             <w:proofErr w:type="spellEnd"/>
                             <w:r>
                               <w:rPr>
+                                <w:rFonts w:ascii="Courier New" w:hAnsi="Courier New" w:cs="Courier New"/>
                                 <w:i/>
                                 <w:iCs/>
                                 <w:lang w:val="en-GB"/>
@@ -834,6 +1617,7 @@
                             </w:r>
                             <w:r>
                               <w:rPr>
+                                <w:rFonts w:ascii="Courier New" w:hAnsi="Courier New" w:cs="Courier New"/>
                                 <w:i/>
                                 <w:iCs/>
                                 <w:lang w:val="en-GB"/>
@@ -844,6 +1628,7 @@
                             <w:proofErr w:type="spellStart"/>
                             <w:r>
                               <w:rPr>
+                                <w:rFonts w:ascii="Courier New" w:hAnsi="Courier New" w:cs="Courier New"/>
                                 <w:i/>
                                 <w:iCs/>
                                 <w:lang w:val="en-GB"/>
@@ -853,6 +1638,7 @@
                             <w:proofErr w:type="spellEnd"/>
                             <w:r>
                               <w:rPr>
+                                <w:rFonts w:ascii="Courier New" w:hAnsi="Courier New" w:cs="Courier New"/>
                                 <w:i/>
                                 <w:iCs/>
                                 <w:lang w:val="en-GB"/>
@@ -861,6 +1647,7 @@
                             </w:r>
                             <w:r>
                               <w:rPr>
+                                <w:rFonts w:ascii="Courier New" w:hAnsi="Courier New" w:cs="Courier New"/>
                                 <w:i/>
                                 <w:iCs/>
                                 <w:lang w:val="en-GB"/>
@@ -870,6 +1657,7 @@
                             </w:r>
                             <w:r>
                               <w:rPr>
+                                <w:rFonts w:ascii="Courier New" w:hAnsi="Courier New" w:cs="Courier New"/>
                                 <w:i/>
                                 <w:iCs/>
                                 <w:lang w:val="en-GB"/>
@@ -879,6 +1667,7 @@
                             </w:r>
                             <w:r>
                               <w:rPr>
+                                <w:rFonts w:ascii="Courier New" w:hAnsi="Courier New" w:cs="Courier New"/>
                                 <w:i/>
                                 <w:iCs/>
                                 <w:lang w:val="en-GB"/>
@@ -888,6 +1677,7 @@
                             </w:r>
                             <w:r>
                               <w:rPr>
+                                <w:rFonts w:ascii="Courier New" w:hAnsi="Courier New" w:cs="Courier New"/>
                                 <w:i/>
                                 <w:iCs/>
                                 <w:lang w:val="en-GB"/>
@@ -919,6 +1709,7 @@
                     <w:p>
                       <w:pPr>
                         <w:rPr>
+                          <w:rFonts w:ascii="Courier New" w:hAnsi="Courier New" w:cs="Courier New"/>
                           <w:i/>
                           <w:iCs/>
                           <w:lang w:val="en-GB"/>
@@ -926,6 +1717,7 @@
                       </w:pPr>
                       <w:r>
                         <w:rPr>
+                          <w:rFonts w:ascii="Courier New" w:hAnsi="Courier New" w:cs="Courier New"/>
                           <w:i/>
                           <w:iCs/>
                           <w:lang w:val="en-GB"/>
@@ -934,6 +1726,7 @@
                       </w:r>
                       <w:r>
                         <w:rPr>
+                          <w:rFonts w:ascii="Courier New" w:hAnsi="Courier New" w:cs="Courier New"/>
                           <w:i/>
                           <w:iCs/>
                           <w:lang w:val="en-GB"/>
@@ -943,6 +1736,7 @@
                       </w:r>
                       <w:r>
                         <w:rPr>
+                          <w:rFonts w:ascii="Courier New" w:hAnsi="Courier New" w:cs="Courier New"/>
                           <w:i/>
                           <w:iCs/>
                           <w:lang w:val="en-GB"/>
@@ -953,6 +1747,7 @@
                       <w:proofErr w:type="spellStart"/>
                       <w:r>
                         <w:rPr>
+                          <w:rFonts w:ascii="Courier New" w:hAnsi="Courier New" w:cs="Courier New"/>
                           <w:i/>
                           <w:iCs/>
                           <w:lang w:val="en-GB"/>
@@ -962,6 +1757,7 @@
                       <w:proofErr w:type="spellEnd"/>
                       <w:r>
                         <w:rPr>
+                          <w:rFonts w:ascii="Courier New" w:hAnsi="Courier New" w:cs="Courier New"/>
                           <w:i/>
                           <w:iCs/>
                           <w:lang w:val="en-GB"/>
@@ -970,6 +1766,7 @@
                       </w:r>
                       <w:r>
                         <w:rPr>
+                          <w:rFonts w:ascii="Courier New" w:hAnsi="Courier New" w:cs="Courier New"/>
                           <w:i/>
                           <w:iCs/>
                           <w:lang w:val="en-GB"/>
@@ -980,6 +1777,7 @@
                       <w:proofErr w:type="spellStart"/>
                       <w:r>
                         <w:rPr>
+                          <w:rFonts w:ascii="Courier New" w:hAnsi="Courier New" w:cs="Courier New"/>
                           <w:i/>
                           <w:iCs/>
                           <w:lang w:val="en-GB"/>
@@ -989,6 +1787,7 @@
                       <w:proofErr w:type="spellEnd"/>
                       <w:r>
                         <w:rPr>
+                          <w:rFonts w:ascii="Courier New" w:hAnsi="Courier New" w:cs="Courier New"/>
                           <w:i/>
                           <w:iCs/>
                           <w:lang w:val="en-GB"/>
@@ -997,6 +1796,7 @@
                       </w:r>
                       <w:r>
                         <w:rPr>
+                          <w:rFonts w:ascii="Courier New" w:hAnsi="Courier New" w:cs="Courier New"/>
                           <w:i/>
                           <w:iCs/>
                           <w:lang w:val="en-GB"/>
@@ -1007,6 +1807,7 @@
                       <w:proofErr w:type="spellStart"/>
                       <w:r>
                         <w:rPr>
+                          <w:rFonts w:ascii="Courier New" w:hAnsi="Courier New" w:cs="Courier New"/>
                           <w:i/>
                           <w:iCs/>
                           <w:lang w:val="en-GB"/>
@@ -1016,6 +1817,7 @@
                       <w:proofErr w:type="spellEnd"/>
                       <w:r>
                         <w:rPr>
+                          <w:rFonts w:ascii="Courier New" w:hAnsi="Courier New" w:cs="Courier New"/>
                           <w:i/>
                           <w:iCs/>
                           <w:lang w:val="en-GB"/>
@@ -1024,6 +1826,7 @@
                       </w:r>
                       <w:r>
                         <w:rPr>
+                          <w:rFonts w:ascii="Courier New" w:hAnsi="Courier New" w:cs="Courier New"/>
                           <w:i/>
                           <w:iCs/>
                           <w:lang w:val="en-GB"/>
@@ -1034,6 +1837,7 @@
                       <w:proofErr w:type="spellStart"/>
                       <w:r>
                         <w:rPr>
+                          <w:rFonts w:ascii="Courier New" w:hAnsi="Courier New" w:cs="Courier New"/>
                           <w:i/>
                           <w:iCs/>
                           <w:lang w:val="en-GB"/>
@@ -1043,6 +1847,7 @@
                       <w:proofErr w:type="spellEnd"/>
                       <w:r>
                         <w:rPr>
+                          <w:rFonts w:ascii="Courier New" w:hAnsi="Courier New" w:cs="Courier New"/>
                           <w:i/>
                           <w:iCs/>
                           <w:lang w:val="en-GB"/>
@@ -1051,6 +1856,7 @@
                       </w:r>
                       <w:r>
                         <w:rPr>
+                          <w:rFonts w:ascii="Courier New" w:hAnsi="Courier New" w:cs="Courier New"/>
                           <w:i/>
                           <w:iCs/>
                           <w:lang w:val="en-GB"/>
@@ -1060,6 +1866,7 @@
                       </w:r>
                       <w:r>
                         <w:rPr>
+                          <w:rFonts w:ascii="Courier New" w:hAnsi="Courier New" w:cs="Courier New"/>
                           <w:i/>
                           <w:iCs/>
                           <w:lang w:val="en-GB"/>
@@ -1069,6 +1876,7 @@
                       </w:r>
                       <w:r>
                         <w:rPr>
+                          <w:rFonts w:ascii="Courier New" w:hAnsi="Courier New" w:cs="Courier New"/>
                           <w:i/>
                           <w:iCs/>
                           <w:lang w:val="en-GB"/>
@@ -1078,6 +1886,7 @@
                       </w:r>
                       <w:r>
                         <w:rPr>
+                          <w:rFonts w:ascii="Courier New" w:hAnsi="Courier New" w:cs="Courier New"/>
                           <w:i/>
                           <w:iCs/>
                           <w:lang w:val="en-GB"/>
@@ -1353,6 +2162,7 @@
         <w:rPr>
           <w:rFonts w:ascii="Arial" w:hAnsi="Arial" w:cs="Arial"/>
         </w:rPr>
+        <w:lastRenderedPageBreak/>
         <w:t>Problems Encountered</w:t>
       </w:r>
     </w:p>
@@ -1367,7 +2177,6 @@
         <w:rPr>
           <w:rFonts w:ascii="Arial" w:hAnsi="Arial" w:cs="Arial"/>
         </w:rPr>
-        <w:lastRenderedPageBreak/>
         <w:t>n/a</w:t>
       </w:r>
     </w:p>
@@ -1697,6 +2506,7 @@
           <w:rFonts w:ascii="Arial" w:hAnsi="Arial" w:cs="Arial"/>
           <w:noProof/>
         </w:rPr>
+        <w:lastRenderedPageBreak/>
         <mc:AlternateContent>
           <mc:Choice Requires="wps">
             <w:drawing>
@@ -1740,6 +2550,7 @@
                           <w:p>
                             <w:pPr>
                               <w:rPr>
+                                <w:rFonts w:ascii="Courier New" w:hAnsi="Courier New" w:cs="Courier New"/>
                                 <w:i/>
                                 <w:iCs/>
                                 <w:lang w:val="en-GB"/>
@@ -1747,6 +2558,7 @@
                             </w:pPr>
                             <w:r>
                               <w:rPr>
+                                <w:rFonts w:ascii="Courier New" w:hAnsi="Courier New" w:cs="Courier New"/>
                                 <w:i/>
                                 <w:iCs/>
                                 <w:lang w:val="en-GB"/>
@@ -1755,23 +2567,17 @@
                             </w:r>
                             <w:r>
                               <w:rPr>
+                                <w:rFonts w:ascii="Courier New" w:hAnsi="Courier New" w:cs="Courier New"/>
                                 <w:i/>
                                 <w:iCs/>
                                 <w:lang w:val="en-GB"/>
                               </w:rPr>
                               <w:br/>
-                              <w:t xml:space="preserve">    </w:t>
+                              <w:t xml:space="preserve">    double rms_phaseA;</w:t>
                             </w:r>
                             <w:r>
                               <w:rPr>
-                                <w:i/>
-                                <w:iCs/>
-                                <w:lang w:val="en-GB"/>
-                              </w:rPr>
-                              <w:t>double rms_phaseA;</w:t>
-                            </w:r>
-                            <w:r>
-                              <w:rPr>
+                                <w:rFonts w:ascii="Courier New" w:hAnsi="Courier New" w:cs="Courier New"/>
                                 <w:i/>
                                 <w:iCs/>
                                 <w:lang w:val="en-GB"/>
@@ -1781,6 +2587,7 @@
                             </w:r>
                             <w:r>
                               <w:rPr>
+                                <w:rFonts w:ascii="Courier New" w:hAnsi="Courier New" w:cs="Courier New"/>
                                 <w:i/>
                                 <w:iCs/>
                                 <w:lang w:val="en-GB"/>
@@ -1790,6 +2597,7 @@
                             </w:r>
                             <w:r>
                               <w:rPr>
+                                <w:rFonts w:ascii="Courier New" w:hAnsi="Courier New" w:cs="Courier New"/>
                                 <w:i/>
                                 <w:iCs/>
                                 <w:lang w:val="en-GB"/>
@@ -1799,6 +2607,7 @@
                             </w:r>
                             <w:r>
                               <w:rPr>
+                                <w:rFonts w:ascii="Courier New" w:hAnsi="Courier New" w:cs="Courier New"/>
                                 <w:i/>
                                 <w:iCs/>
                                 <w:lang w:val="en-GB"/>
@@ -1826,6 +2635,7 @@
                     <w:p>
                       <w:pPr>
                         <w:rPr>
+                          <w:rFonts w:ascii="Courier New" w:hAnsi="Courier New" w:cs="Courier New"/>
                           <w:i/>
                           <w:iCs/>
                           <w:lang w:val="en-GB"/>
@@ -1833,6 +2643,7 @@
                       </w:pPr>
                       <w:r>
                         <w:rPr>
+                          <w:rFonts w:ascii="Courier New" w:hAnsi="Courier New" w:cs="Courier New"/>
                           <w:i/>
                           <w:iCs/>
                           <w:lang w:val="en-GB"/>
@@ -1841,23 +2652,17 @@
                       </w:r>
                       <w:r>
                         <w:rPr>
+                          <w:rFonts w:ascii="Courier New" w:hAnsi="Courier New" w:cs="Courier New"/>
                           <w:i/>
                           <w:iCs/>
                           <w:lang w:val="en-GB"/>
                         </w:rPr>
                         <w:br/>
-                        <w:t xml:space="preserve">    </w:t>
+                        <w:t xml:space="preserve">    double rms_phaseA;</w:t>
                       </w:r>
                       <w:r>
                         <w:rPr>
-                          <w:i/>
-                          <w:iCs/>
-                          <w:lang w:val="en-GB"/>
-                        </w:rPr>
-                        <w:t>double rms_phaseA;</w:t>
-                      </w:r>
-                      <w:r>
-                        <w:rPr>
+                          <w:rFonts w:ascii="Courier New" w:hAnsi="Courier New" w:cs="Courier New"/>
                           <w:i/>
                           <w:iCs/>
                           <w:lang w:val="en-GB"/>
@@ -1867,6 +2672,7 @@
                       </w:r>
                       <w:r>
                         <w:rPr>
+                          <w:rFonts w:ascii="Courier New" w:hAnsi="Courier New" w:cs="Courier New"/>
                           <w:i/>
                           <w:iCs/>
                           <w:lang w:val="en-GB"/>
@@ -1876,6 +2682,7 @@
                       </w:r>
                       <w:r>
                         <w:rPr>
+                          <w:rFonts w:ascii="Courier New" w:hAnsi="Courier New" w:cs="Courier New"/>
                           <w:i/>
                           <w:iCs/>
                           <w:lang w:val="en-GB"/>
@@ -1885,6 +2692,7 @@
                       </w:r>
                       <w:r>
                         <w:rPr>
+                          <w:rFonts w:ascii="Courier New" w:hAnsi="Courier New" w:cs="Courier New"/>
                           <w:i/>
                           <w:iCs/>
                           <w:lang w:val="en-GB"/>
@@ -1913,7 +2721,6 @@
         <w:rPr>
           <w:rFonts w:ascii="Arial" w:hAnsi="Arial" w:cs="Arial"/>
         </w:rPr>
-        <w:lastRenderedPageBreak/>
         <w:t xml:space="preserve">The </w:t>
       </w:r>
       <w:r>
@@ -2380,7 +3187,7 @@
                     <pic:cNvPicPr/>
                   </pic:nvPicPr>
                   <pic:blipFill>
-                    <a:blip r:embed="rId6"/>
+                    <a:blip r:embed="rId8"/>
                     <a:stretch>
                       <a:fillRect/>
                     </a:stretch>
@@ -2652,6 +3459,7 @@
         <w:rPr>
           <w:rFonts w:ascii="Arial" w:hAnsi="Arial" w:cs="Arial"/>
         </w:rPr>
+        <w:lastRenderedPageBreak/>
         <w:t>Problems Encountered</w:t>
       </w:r>
     </w:p>
@@ -2666,7 +3474,6 @@
         <w:rPr>
           <w:rFonts w:ascii="Arial" w:hAnsi="Arial" w:cs="Arial"/>
         </w:rPr>
-        <w:lastRenderedPageBreak/>
         <w:t>n/a</w:t>
       </w:r>
     </w:p>
@@ -2766,6 +3573,22 @@
     </w:p>
     <w:p>
       <w:pPr>
+        <w:rPr>
+          <w:rFonts w:ascii="Arial" w:eastAsiaTheme="majorEastAsia" w:hAnsi="Arial" w:cs="Arial"/>
+          <w:b/>
+          <w:bCs/>
+        </w:rPr>
+      </w:pPr>
+      <w:bookmarkStart w:id="2" w:name="_Toc228450359"/>
+      <w:r>
+        <w:rPr>
+          <w:rFonts w:cs="Arial"/>
+        </w:rPr>
+        <w:br w:type="page"/>
+      </w:r>
+    </w:p>
+    <w:p>
+      <w:pPr>
         <w:pStyle w:val="Heading1"/>
         <w:numPr>
           <w:ilvl w:val="0"/>
@@ -2783,8 +3606,10 @@
           <w:sz w:val="22"/>
           <w:szCs w:val="22"/>
         </w:rPr>
+        <w:lastRenderedPageBreak/>
         <w:t>Testing</w:t>
       </w:r>
+      <w:bookmarkEnd w:id="2"/>
     </w:p>
     <w:p>
       <w:pPr>
@@ -3194,7 +4019,6 @@
         <w:rPr>
           <w:rFonts w:ascii="Arial" w:hAnsi="Arial" w:cs="Arial"/>
         </w:rPr>
-        <w:lastRenderedPageBreak/>
         <w:t>Testing with a constant signal (expected RMS equals the constant value)</w:t>
       </w:r>
     </w:p>
@@ -3280,14 +4104,17 @@
           <w:szCs w:val="22"/>
         </w:rPr>
       </w:pPr>
+      <w:bookmarkStart w:id="3" w:name="_Toc228450360"/>
       <w:r>
         <w:rPr>
           <w:rFonts w:cs="Arial"/>
           <w:sz w:val="22"/>
           <w:szCs w:val="22"/>
         </w:rPr>
+        <w:lastRenderedPageBreak/>
         <w:t>Reflection</w:t>
       </w:r>
+      <w:bookmarkEnd w:id="3"/>
     </w:p>
     <w:p>
       <w:pPr>
@@ -3590,7 +4417,6 @@
           <w:rFonts w:ascii="Arial" w:eastAsia="Times New Roman" w:hAnsi="Arial" w:cs="Arial"/>
           <w:lang w:val="en-GB" w:eastAsia="en-GB"/>
         </w:rPr>
-        <w:lastRenderedPageBreak/>
         <w:t>Overall, the project demonstrates solid progression from a basic file parser to a structured signal analysis tool, with clear improvements in software design, memory management, and numerical validation throughout development.</w:t>
       </w:r>
     </w:p>
@@ -3607,6 +4433,8 @@
       </w:pPr>
     </w:p>
     <w:sectPr>
+      <w:headerReference w:type="default" r:id="rId9"/>
+      <w:footerReference w:type="default" r:id="rId10"/>
       <w:pgSz w:w="12240" w:h="15840"/>
       <w:pgMar w:top="1134" w:right="1134" w:bottom="1134" w:left="1134" w:header="720" w:footer="720" w:gutter="0"/>
       <w:cols w:space="720"/>
@@ -3614,6 +4442,344 @@
     </w:sectPr>
   </w:body>
 </w:document>
+</file>
+
+<file path=word/endnotes.xml><?xml version="1.0" encoding="utf-8"?>
+<w:endnotes xmlns:wpc="http://schemas.microsoft.com/office/word/2010/wordprocessingCanvas" xmlns:cx="http://schemas.microsoft.com/office/drawing/2014/chartex" xmlns:cx1="http://schemas.microsoft.com/office/drawing/2015/9/8/chartex" xmlns:cx2="http://schemas.microsoft.com/office/drawing/2015/10/21/chartex" xmlns:cx3="http://schemas.microsoft.com/office/drawing/2016/5/9/chartex" xmlns:cx4="http://schemas.microsoft.com/office/drawing/2016/5/10/chartex" xmlns:cx5="http://schemas.microsoft.com/office/drawing/2016/5/11/chartex" xmlns:cx6="http://schemas.microsoft.com/office/drawing/2016/5/12/chartex" xmlns:cx7="http://schemas.microsoft.com/office/drawing/2016/5/13/chartex" xmlns:cx8="http://schemas.microsoft.com/office/drawing/2016/5/14/chartex" xmlns:mc="http://schemas.openxmlformats.org/markup-compatibility/2006" xmlns:aink="http://schemas.microsoft.com/office/drawing/2016/ink" xmlns:am3d="http://schemas.microsoft.com/office/drawing/2017/model3d" xmlns:o="urn:schemas-microsoft-com:office:office" xmlns:oel="http://schemas.microsoft.com/office/2019/extlst" xmlns:r="http://schemas.openxmlformats.org/officeDocument/2006/relationships" xmlns:m="http://schemas.openxmlformats.org/officeDocument/2006/math" xmlns:v="urn:schemas-microsoft-com:vml" xmlns:wp14="http://schemas.microsoft.com/office/word/2010/wordprocessingDrawing" xmlns:wp="http://schemas.openxmlformats.org/drawingml/2006/wordprocessingDrawing" xmlns:w10="urn:schemas-microsoft-com:office:word" xmlns:w="http://schemas.openxmlformats.org/wordprocessingml/2006/main" xmlns:w14="http://schemas.microsoft.com/office/word/2010/wordml" xmlns:w15="http://schemas.microsoft.com/office/word/2012/wordml" xmlns:w16cex="http://schemas.microsoft.com/office/word/2018/wordml/cex" xmlns:w16cid="http://schemas.microsoft.com/office/word/2016/wordml/cid" xmlns:w16="http://schemas.microsoft.com/office/word/2018/wordml" xmlns:w16du="http://schemas.microsoft.com/office/word/2023/wordml/word16du" xmlns:w16sdtdh="http://schemas.microsoft.com/office/word/2020/wordml/sdtdatahash" xmlns:w16sdtfl="http://schemas.microsoft.com/office/word/2024/wordml/sdtformatlock" xmlns:w16se="http://schemas.microsoft.com/office/word/2015/wordml/symex" xmlns:wpg="http://schemas.microsoft.com/office/word/2010/wordprocessingGroup" xmlns:wpi="http://schemas.microsoft.com/office/word/2010/wordprocessingInk" xmlns:wne="http://schemas.microsoft.com/office/word/2006/wordml" xmlns:wps="http://schemas.microsoft.com/office/word/2010/wordprocessingShape" mc:Ignorable="w14 w15 w16se w16cid w16 w16cex w16sdtdh w16sdtfl w16du wp14">
+  <w:endnote w:type="separator" w:id="-1">
+    <w:p>
+      <w:pPr>
+        <w:spacing w:after="0" w:line="240" w:lineRule="auto"/>
+      </w:pPr>
+      <w:r>
+        <w:separator/>
+      </w:r>
+    </w:p>
+  </w:endnote>
+  <w:endnote w:type="continuationSeparator" w:id="0">
+    <w:p>
+      <w:pPr>
+        <w:spacing w:after="0" w:line="240" w:lineRule="auto"/>
+      </w:pPr>
+      <w:r>
+        <w:continuationSeparator/>
+      </w:r>
+    </w:p>
+  </w:endnote>
+</w:endnotes>
+</file>
+
+<file path=word/footer1.xml><?xml version="1.0" encoding="utf-8"?>
+<w:ftr xmlns:wpc="http://schemas.microsoft.com/office/word/2010/wordprocessingCanvas" xmlns:cx="http://schemas.microsoft.com/office/drawing/2014/chartex" xmlns:cx1="http://schemas.microsoft.com/office/drawing/2015/9/8/chartex" xmlns:cx2="http://schemas.microsoft.com/office/drawing/2015/10/21/chartex" xmlns:cx3="http://schemas.microsoft.com/office/drawing/2016/5/9/chartex" xmlns:cx4="http://schemas.microsoft.com/office/drawing/2016/5/10/chartex" xmlns:cx5="http://schemas.microsoft.com/office/drawing/2016/5/11/chartex" xmlns:cx6="http://schemas.microsoft.com/office/drawing/2016/5/12/chartex" xmlns:cx7="http://schemas.microsoft.com/office/drawing/2016/5/13/chartex" xmlns:cx8="http://schemas.microsoft.com/office/drawing/2016/5/14/chartex" xmlns:mc="http://schemas.openxmlformats.org/markup-compatibility/2006" xmlns:aink="http://schemas.microsoft.com/office/drawing/2016/ink" xmlns:am3d="http://schemas.microsoft.com/office/drawing/2017/model3d" xmlns:o="urn:schemas-microsoft-com:office:office" xmlns:oel="http://schemas.microsoft.com/office/2019/extlst" xmlns:r="http://schemas.openxmlformats.org/officeDocument/2006/relationships" xmlns:m="http://schemas.openxmlformats.org/officeDocument/2006/math" xmlns:v="urn:schemas-microsoft-com:vml" xmlns:wp14="http://schemas.microsoft.com/office/word/2010/wordprocessingDrawing" xmlns:wp="http://schemas.openxmlformats.org/drawingml/2006/wordprocessingDrawing" xmlns:w10="urn:schemas-microsoft-com:office:word" xmlns:w="http://schemas.openxmlformats.org/wordprocessingml/2006/main" xmlns:w14="http://schemas.microsoft.com/office/word/2010/wordml" xmlns:w15="http://schemas.microsoft.com/office/word/2012/wordml" xmlns:w16cex="http://schemas.microsoft.com/office/word/2018/wordml/cex" xmlns:w16cid="http://schemas.microsoft.com/office/word/2016/wordml/cid" xmlns:w16="http://schemas.microsoft.com/office/word/2018/wordml" xmlns:w16du="http://schemas.microsoft.com/office/word/2023/wordml/word16du" xmlns:w16sdtdh="http://schemas.microsoft.com/office/word/2020/wordml/sdtdatahash" xmlns:w16sdtfl="http://schemas.microsoft.com/office/word/2024/wordml/sdtformatlock" xmlns:w16se="http://schemas.microsoft.com/office/word/2015/wordml/symex" xmlns:wpg="http://schemas.microsoft.com/office/word/2010/wordprocessingGroup" xmlns:wpi="http://schemas.microsoft.com/office/word/2010/wordprocessingInk" xmlns:wne="http://schemas.microsoft.com/office/word/2006/wordml" xmlns:wps="http://schemas.microsoft.com/office/word/2010/wordprocessingShape" mc:Ignorable="w14 w15 w16se w16cid w16 w16cex w16sdtdh w16sdtfl w16du wp14">
+  <w:p>
+    <w:pPr>
+      <w:pStyle w:val="Footer"/>
+      <w:jc w:val="right"/>
+    </w:pPr>
+  </w:p>
+  <w:tbl>
+    <w:tblPr>
+      <w:tblStyle w:val="TableGrid"/>
+      <w:tblW w:w="0" w:type="auto"/>
+      <w:tblBorders>
+        <w:top w:val="none" w:sz="0" w:space="0" w:color="auto"/>
+        <w:left w:val="none" w:sz="0" w:space="0" w:color="auto"/>
+        <w:bottom w:val="none" w:sz="0" w:space="0" w:color="auto"/>
+        <w:right w:val="none" w:sz="0" w:space="0" w:color="auto"/>
+        <w:insideH w:val="none" w:sz="0" w:space="0" w:color="auto"/>
+        <w:insideV w:val="none" w:sz="0" w:space="0" w:color="auto"/>
+      </w:tblBorders>
+      <w:tblLook w:val="04A0" w:firstRow="1" w:lastRow="0" w:firstColumn="1" w:lastColumn="0" w:noHBand="0" w:noVBand="1"/>
+    </w:tblPr>
+    <w:tblGrid>
+      <w:gridCol w:w="4981"/>
+      <w:gridCol w:w="4981"/>
+    </w:tblGrid>
+    <w:tr>
+      <w:tc>
+        <w:tcPr>
+          <w:tcW w:w="4981" w:type="dxa"/>
+        </w:tcPr>
+        <w:p>
+          <w:pPr>
+            <w:pStyle w:val="Header"/>
+            <w:rPr>
+              <w:rFonts w:ascii="Arial" w:hAnsi="Arial" w:cs="Arial"/>
+            </w:rPr>
+          </w:pPr>
+          <w:r>
+            <w:rPr>
+              <w:rFonts w:ascii="Arial" w:hAnsi="Arial" w:cs="Arial"/>
+            </w:rPr>
+            <w:t>Joseph Westing</w:t>
+          </w:r>
+          <w:r>
+            <w:rPr>
+              <w:rFonts w:ascii="Arial" w:hAnsi="Arial" w:cs="Arial"/>
+            </w:rPr>
+            <w:t xml:space="preserve"> - 24026929</w:t>
+          </w:r>
+        </w:p>
+      </w:tc>
+      <w:tc>
+        <w:tcPr>
+          <w:tcW w:w="4981" w:type="dxa"/>
+        </w:tcPr>
+        <w:sdt>
+          <w:sdtPr>
+            <w:rPr>
+              <w:rFonts w:ascii="Arial" w:hAnsi="Arial" w:cs="Arial"/>
+            </w:rPr>
+            <w:id w:val="1132604990"/>
+            <w:docPartObj>
+              <w:docPartGallery w:val="Page Numbers (Bottom of Page)"/>
+              <w:docPartUnique/>
+            </w:docPartObj>
+          </w:sdtPr>
+          <w:sdtContent>
+            <w:sdt>
+              <w:sdtPr>
+                <w:rPr>
+                  <w:rFonts w:ascii="Arial" w:hAnsi="Arial" w:cs="Arial"/>
+                </w:rPr>
+                <w:id w:val="-1769616900"/>
+                <w:docPartObj>
+                  <w:docPartGallery w:val="Page Numbers (Top of Page)"/>
+                  <w:docPartUnique/>
+                </w:docPartObj>
+              </w:sdtPr>
+              <w:sdtContent>
+                <w:p>
+                  <w:pPr>
+                    <w:pStyle w:val="Footer"/>
+                    <w:jc w:val="right"/>
+                    <w:rPr>
+                      <w:rFonts w:ascii="Arial" w:hAnsi="Arial" w:cs="Arial"/>
+                    </w:rPr>
+                  </w:pPr>
+                  <w:r>
+                    <w:rPr>
+                      <w:rFonts w:ascii="Arial" w:hAnsi="Arial" w:cs="Arial"/>
+                      <w:lang w:val="en-GB"/>
+                    </w:rPr>
+                    <w:t xml:space="preserve">Page </w:t>
+                  </w:r>
+                  <w:r>
+                    <w:rPr>
+                      <w:rFonts w:ascii="Arial" w:hAnsi="Arial" w:cs="Arial"/>
+                      <w:b/>
+                      <w:bCs/>
+                    </w:rPr>
+                    <w:fldChar w:fldCharType="begin"/>
+                  </w:r>
+                  <w:r>
+                    <w:rPr>
+                      <w:rFonts w:ascii="Arial" w:hAnsi="Arial" w:cs="Arial"/>
+                      <w:b/>
+                      <w:bCs/>
+                    </w:rPr>
+                    <w:instrText>PAGE</w:instrText>
+                  </w:r>
+                  <w:r>
+                    <w:rPr>
+                      <w:rFonts w:ascii="Arial" w:hAnsi="Arial" w:cs="Arial"/>
+                      <w:b/>
+                      <w:bCs/>
+                    </w:rPr>
+                    <w:fldChar w:fldCharType="separate"/>
+                  </w:r>
+                  <w:r>
+                    <w:rPr>
+                      <w:rFonts w:ascii="Arial" w:hAnsi="Arial" w:cs="Arial"/>
+                      <w:b/>
+                      <w:bCs/>
+                    </w:rPr>
+                    <w:t>1</w:t>
+                  </w:r>
+                  <w:r>
+                    <w:rPr>
+                      <w:rFonts w:ascii="Arial" w:hAnsi="Arial" w:cs="Arial"/>
+                      <w:b/>
+                      <w:bCs/>
+                    </w:rPr>
+                    <w:fldChar w:fldCharType="end"/>
+                  </w:r>
+                  <w:r>
+                    <w:rPr>
+                      <w:rFonts w:ascii="Arial" w:hAnsi="Arial" w:cs="Arial"/>
+                      <w:lang w:val="en-GB"/>
+                    </w:rPr>
+                    <w:t xml:space="preserve"> of </w:t>
+                  </w:r>
+                  <w:r>
+                    <w:rPr>
+                      <w:rFonts w:ascii="Arial" w:hAnsi="Arial" w:cs="Arial"/>
+                      <w:b/>
+                      <w:bCs/>
+                    </w:rPr>
+                    <w:fldChar w:fldCharType="begin"/>
+                  </w:r>
+                  <w:r>
+                    <w:rPr>
+                      <w:rFonts w:ascii="Arial" w:hAnsi="Arial" w:cs="Arial"/>
+                      <w:b/>
+                      <w:bCs/>
+                    </w:rPr>
+                    <w:instrText>NUMPAGES</w:instrText>
+                  </w:r>
+                  <w:r>
+                    <w:rPr>
+                      <w:rFonts w:ascii="Arial" w:hAnsi="Arial" w:cs="Arial"/>
+                      <w:b/>
+                      <w:bCs/>
+                    </w:rPr>
+                    <w:fldChar w:fldCharType="separate"/>
+                  </w:r>
+                  <w:r>
+                    <w:rPr>
+                      <w:rFonts w:ascii="Arial" w:hAnsi="Arial" w:cs="Arial"/>
+                      <w:b/>
+                      <w:bCs/>
+                    </w:rPr>
+                    <w:t>9</w:t>
+                  </w:r>
+                  <w:r>
+                    <w:rPr>
+                      <w:rFonts w:ascii="Arial" w:hAnsi="Arial" w:cs="Arial"/>
+                      <w:b/>
+                      <w:bCs/>
+                    </w:rPr>
+                    <w:fldChar w:fldCharType="end"/>
+                  </w:r>
+                </w:p>
+              </w:sdtContent>
+            </w:sdt>
+          </w:sdtContent>
+        </w:sdt>
+      </w:tc>
+    </w:tr>
+  </w:tbl>
+  <w:p>
+    <w:pPr>
+      <w:pStyle w:val="Footer"/>
+    </w:pPr>
+  </w:p>
+</w:ftr>
+</file>
+
+<file path=word/footnotes.xml><?xml version="1.0" encoding="utf-8"?>
+<w:footnotes xmlns:wpc="http://schemas.microsoft.com/office/word/2010/wordprocessingCanvas" xmlns:cx="http://schemas.microsoft.com/office/drawing/2014/chartex" xmlns:cx1="http://schemas.microsoft.com/office/drawing/2015/9/8/chartex" xmlns:cx2="http://schemas.microsoft.com/office/drawing/2015/10/21/chartex" xmlns:cx3="http://schemas.microsoft.com/office/drawing/2016/5/9/chartex" xmlns:cx4="http://schemas.microsoft.com/office/drawing/2016/5/10/chartex" xmlns:cx5="http://schemas.microsoft.com/office/drawing/2016/5/11/chartex" xmlns:cx6="http://schemas.microsoft.com/office/drawing/2016/5/12/chartex" xmlns:cx7="http://schemas.microsoft.com/office/drawing/2016/5/13/chartex" xmlns:cx8="http://schemas.microsoft.com/office/drawing/2016/5/14/chartex" xmlns:mc="http://schemas.openxmlformats.org/markup-compatibility/2006" xmlns:aink="http://schemas.microsoft.com/office/drawing/2016/ink" xmlns:am3d="http://schemas.microsoft.com/office/drawing/2017/model3d" xmlns:o="urn:schemas-microsoft-com:office:office" xmlns:oel="http://schemas.microsoft.com/office/2019/extlst" xmlns:r="http://schemas.openxmlformats.org/officeDocument/2006/relationships" xmlns:m="http://schemas.openxmlformats.org/officeDocument/2006/math" xmlns:v="urn:schemas-microsoft-com:vml" xmlns:wp14="http://schemas.microsoft.com/office/word/2010/wordprocessingDrawing" xmlns:wp="http://schemas.openxmlformats.org/drawingml/2006/wordprocessingDrawing" xmlns:w10="urn:schemas-microsoft-com:office:word" xmlns:w="http://schemas.openxmlformats.org/wordprocessingml/2006/main" xmlns:w14="http://schemas.microsoft.com/office/word/2010/wordml" xmlns:w15="http://schemas.microsoft.com/office/word/2012/wordml" xmlns:w16cex="http://schemas.microsoft.com/office/word/2018/wordml/cex" xmlns:w16cid="http://schemas.microsoft.com/office/word/2016/wordml/cid" xmlns:w16="http://schemas.microsoft.com/office/word/2018/wordml" xmlns:w16du="http://schemas.microsoft.com/office/word/2023/wordml/word16du" xmlns:w16sdtdh="http://schemas.microsoft.com/office/word/2020/wordml/sdtdatahash" xmlns:w16sdtfl="http://schemas.microsoft.com/office/word/2024/wordml/sdtformatlock" xmlns:w16se="http://schemas.microsoft.com/office/word/2015/wordml/symex" xmlns:wpg="http://schemas.microsoft.com/office/word/2010/wordprocessingGroup" xmlns:wpi="http://schemas.microsoft.com/office/word/2010/wordprocessingInk" xmlns:wne="http://schemas.microsoft.com/office/word/2006/wordml" xmlns:wps="http://schemas.microsoft.com/office/word/2010/wordprocessingShape" mc:Ignorable="w14 w15 w16se w16cid w16 w16cex w16sdtdh w16sdtfl w16du wp14">
+  <w:footnote w:type="separator" w:id="-1">
+    <w:p>
+      <w:pPr>
+        <w:spacing w:after="0" w:line="240" w:lineRule="auto"/>
+      </w:pPr>
+      <w:r>
+        <w:separator/>
+      </w:r>
+    </w:p>
+  </w:footnote>
+  <w:footnote w:type="continuationSeparator" w:id="0">
+    <w:p>
+      <w:pPr>
+        <w:spacing w:after="0" w:line="240" w:lineRule="auto"/>
+      </w:pPr>
+      <w:r>
+        <w:continuationSeparator/>
+      </w:r>
+    </w:p>
+  </w:footnote>
+</w:footnotes>
+</file>
+
+<file path=word/header1.xml><?xml version="1.0" encoding="utf-8"?>
+<w:hdr xmlns:wpc="http://schemas.microsoft.com/office/word/2010/wordprocessingCanvas" xmlns:cx="http://schemas.microsoft.com/office/drawing/2014/chartex" xmlns:cx1="http://schemas.microsoft.com/office/drawing/2015/9/8/chartex" xmlns:cx2="http://schemas.microsoft.com/office/drawing/2015/10/21/chartex" xmlns:cx3="http://schemas.microsoft.com/office/drawing/2016/5/9/chartex" xmlns:cx4="http://schemas.microsoft.com/office/drawing/2016/5/10/chartex" xmlns:cx5="http://schemas.microsoft.com/office/drawing/2016/5/11/chartex" xmlns:cx6="http://schemas.microsoft.com/office/drawing/2016/5/12/chartex" xmlns:cx7="http://schemas.microsoft.com/office/drawing/2016/5/13/chartex" xmlns:cx8="http://schemas.microsoft.com/office/drawing/2016/5/14/chartex" xmlns:mc="http://schemas.openxmlformats.org/markup-compatibility/2006" xmlns:aink="http://schemas.microsoft.com/office/drawing/2016/ink" xmlns:am3d="http://schemas.microsoft.com/office/drawing/2017/model3d" xmlns:o="urn:schemas-microsoft-com:office:office" xmlns:oel="http://schemas.microsoft.com/office/2019/extlst" xmlns:r="http://schemas.openxmlformats.org/officeDocument/2006/relationships" xmlns:m="http://schemas.openxmlformats.org/officeDocument/2006/math" xmlns:v="urn:schemas-microsoft-com:vml" xmlns:wp14="http://schemas.microsoft.com/office/word/2010/wordprocessingDrawing" xmlns:wp="http://schemas.openxmlformats.org/drawingml/2006/wordprocessingDrawing" xmlns:w10="urn:schemas-microsoft-com:office:word" xmlns:w="http://schemas.openxmlformats.org/wordprocessingml/2006/main" xmlns:w14="http://schemas.microsoft.com/office/word/2010/wordml" xmlns:w15="http://schemas.microsoft.com/office/word/2012/wordml" xmlns:w16cex="http://schemas.microsoft.com/office/word/2018/wordml/cex" xmlns:w16cid="http://schemas.microsoft.com/office/word/2016/wordml/cid" xmlns:w16="http://schemas.microsoft.com/office/word/2018/wordml" xmlns:w16du="http://schemas.microsoft.com/office/word/2023/wordml/word16du" xmlns:w16sdtdh="http://schemas.microsoft.com/office/word/2020/wordml/sdtdatahash" xmlns:w16sdtfl="http://schemas.microsoft.com/office/word/2024/wordml/sdtformatlock" xmlns:w16se="http://schemas.microsoft.com/office/word/2015/wordml/symex" xmlns:wpg="http://schemas.microsoft.com/office/word/2010/wordprocessingGroup" xmlns:wpi="http://schemas.microsoft.com/office/word/2010/wordprocessingInk" xmlns:wne="http://schemas.microsoft.com/office/word/2006/wordml" xmlns:wps="http://schemas.microsoft.com/office/word/2010/wordprocessingShape" mc:Ignorable="w14 w15 w16se w16cid w16 w16cex w16sdtdh w16sdtfl w16du wp14">
+  <w:tbl>
+    <w:tblPr>
+      <w:tblStyle w:val="TableGrid"/>
+      <w:tblW w:w="0" w:type="auto"/>
+      <w:tblBorders>
+        <w:top w:val="none" w:sz="0" w:space="0" w:color="auto"/>
+        <w:left w:val="none" w:sz="0" w:space="0" w:color="auto"/>
+        <w:bottom w:val="none" w:sz="0" w:space="0" w:color="auto"/>
+        <w:right w:val="none" w:sz="0" w:space="0" w:color="auto"/>
+        <w:insideH w:val="none" w:sz="0" w:space="0" w:color="auto"/>
+        <w:insideV w:val="none" w:sz="0" w:space="0" w:color="auto"/>
+      </w:tblBorders>
+      <w:tblLook w:val="04A0" w:firstRow="1" w:lastRow="0" w:firstColumn="1" w:lastColumn="0" w:noHBand="0" w:noVBand="1"/>
+    </w:tblPr>
+    <w:tblGrid>
+      <w:gridCol w:w="4981"/>
+      <w:gridCol w:w="4981"/>
+    </w:tblGrid>
+    <w:tr>
+      <w:tc>
+        <w:tcPr>
+          <w:tcW w:w="4981" w:type="dxa"/>
+        </w:tcPr>
+        <w:p>
+          <w:pPr>
+            <w:pStyle w:val="Header"/>
+            <w:rPr>
+              <w:rFonts w:ascii="Arial" w:hAnsi="Arial" w:cs="Arial"/>
+            </w:rPr>
+          </w:pPr>
+          <w:r>
+            <w:rPr>
+              <w:rFonts w:ascii="Arial" w:hAnsi="Arial" w:cs="Arial"/>
+            </w:rPr>
+            <w:t>UGMFGT_15_1</w:t>
+          </w:r>
+          <w:r>
+            <w:rPr>
+              <w:rFonts w:ascii="Arial" w:hAnsi="Arial" w:cs="Arial"/>
+            </w:rPr>
+            <w:t>: Programming for Engineers</w:t>
+          </w:r>
+        </w:p>
+      </w:tc>
+      <w:tc>
+        <w:tcPr>
+          <w:tcW w:w="4981" w:type="dxa"/>
+        </w:tcPr>
+        <w:p>
+          <w:pPr>
+            <w:pStyle w:val="Header"/>
+            <w:jc w:val="right"/>
+            <w:rPr>
+              <w:rFonts w:ascii="Arial" w:hAnsi="Arial" w:cs="Arial"/>
+            </w:rPr>
+          </w:pPr>
+          <w:r>
+            <w:rPr>
+              <w:rFonts w:ascii="Arial" w:hAnsi="Arial" w:cs="Arial"/>
+            </w:rPr>
+            <w:t xml:space="preserve">Power Factor </w:t>
+          </w:r>
+          <w:proofErr w:type="spellStart"/>
+          <w:r>
+            <w:rPr>
+              <w:rFonts w:ascii="Arial" w:hAnsi="Arial" w:cs="Arial"/>
+            </w:rPr>
+            <w:t>Analyser</w:t>
+          </w:r>
+          <w:proofErr w:type="spellEnd"/>
+          <w:r>
+            <w:rPr>
+              <w:rFonts w:ascii="Arial" w:hAnsi="Arial" w:cs="Arial"/>
+            </w:rPr>
+            <w:t xml:space="preserve"> - Logbook</w:t>
+          </w:r>
+        </w:p>
+      </w:tc>
+    </w:tr>
+  </w:tbl>
+  <w:p>
+    <w:pPr>
+      <w:pStyle w:val="Header"/>
+    </w:pPr>
+  </w:p>
+</w:hdr>
 </file>
 
 <file path=word/numbering.xml><?xml version="1.0" encoding="utf-8"?>
@@ -5966,7 +7132,6 @@
   <w:style w:type="character" w:default="1" w:styleId="DefaultParagraphFont">
     <w:name w:val="Default Paragraph Font"/>
     <w:uiPriority w:val="1"/>
-    <w:semiHidden/>
     <w:unhideWhenUsed/>
   </w:style>
   <w:style w:type="table" w:default="1" w:styleId="TableNormal">
@@ -6092,20 +7257,16 @@
     <w:link w:val="TitleChar"/>
     <w:uiPriority w:val="10"/>
     <w:qFormat/>
-    <w:rsid w:val="00FC693F"/>
+    <w:rsid w:val="007746D6"/>
     <w:pPr>
-      <w:pBdr>
-        <w:bottom w:val="single" w:sz="8" w:space="4" w:color="4F81BD" w:themeColor="accent1"/>
-      </w:pBdr>
       <w:spacing w:after="300" w:line="240" w:lineRule="auto"/>
       <w:contextualSpacing/>
     </w:pPr>
     <w:rPr>
-      <w:rFonts w:asciiTheme="majorHAnsi" w:eastAsiaTheme="majorEastAsia" w:hAnsiTheme="majorHAnsi" w:cstheme="majorBidi"/>
-      <w:color w:val="17365D" w:themeColor="text2" w:themeShade="BF"/>
+      <w:rFonts w:ascii="Arial" w:eastAsiaTheme="majorEastAsia" w:hAnsi="Arial" w:cstheme="majorBidi"/>
       <w:spacing w:val="5"/>
       <w:kern w:val="28"/>
-      <w:sz w:val="52"/>
+      <w:sz w:val="32"/>
       <w:szCs w:val="52"/>
     </w:rPr>
   </w:style>
@@ -6114,13 +7275,12 @@
     <w:basedOn w:val="DefaultParagraphFont"/>
     <w:link w:val="Title"/>
     <w:uiPriority w:val="10"/>
-    <w:rsid w:val="00FC693F"/>
+    <w:rsid w:val="007746D6"/>
     <w:rPr>
-      <w:rFonts w:asciiTheme="majorHAnsi" w:eastAsiaTheme="majorEastAsia" w:hAnsiTheme="majorHAnsi" w:cstheme="majorBidi"/>
-      <w:color w:val="17365D" w:themeColor="text2" w:themeShade="BF"/>
+      <w:rFonts w:ascii="Arial" w:eastAsiaTheme="majorEastAsia" w:hAnsi="Arial" w:cstheme="majorBidi"/>
       <w:spacing w:val="5"/>
       <w:kern w:val="28"/>
-      <w:sz w:val="52"/>
+      <w:sz w:val="32"/>
       <w:szCs w:val="52"/>
     </w:rPr>
   </w:style>
@@ -6680,7 +7840,6 @@
     <w:basedOn w:val="Heading1"/>
     <w:next w:val="Normal"/>
     <w:uiPriority w:val="39"/>
-    <w:semiHidden/>
     <w:unhideWhenUsed/>
     <w:qFormat/>
     <w:rsid w:val="00FC693F"/>
@@ -16780,6 +17939,29 @@
       <w:rFonts w:ascii="Courier New" w:eastAsia="Times New Roman" w:hAnsi="Courier New" w:cs="Courier New"/>
       <w:sz w:val="20"/>
       <w:szCs w:val="20"/>
+    </w:rPr>
+  </w:style>
+  <w:style w:type="paragraph" w:styleId="TOC1">
+    <w:name w:val="toc 1"/>
+    <w:basedOn w:val="Normal"/>
+    <w:next w:val="Normal"/>
+    <w:autoRedefine/>
+    <w:uiPriority w:val="39"/>
+    <w:unhideWhenUsed/>
+    <w:rsid w:val="001714A7"/>
+    <w:pPr>
+      <w:spacing w:after="100"/>
+    </w:pPr>
+  </w:style>
+  <w:style w:type="character" w:styleId="Hyperlink">
+    <w:name w:val="Hyperlink"/>
+    <w:basedOn w:val="DefaultParagraphFont"/>
+    <w:uiPriority w:val="99"/>
+    <w:unhideWhenUsed/>
+    <w:rsid w:val="001714A7"/>
+    <w:rPr>
+      <w:color w:val="0000FF" w:themeColor="hyperlink"/>
+      <w:u w:val="single"/>
     </w:rPr>
   </w:style>
 </w:styles>

</xml_diff>